<commit_message>
报告修改参数 FGImax	FG2min	Figmax为 6.8	2.2	6.8
</commit_message>
<xml_diff>
--- a/mainWidget/mainWidget/src/template/射流冲击仿真计算数据表.docx
+++ b/mainWidget/mainWidget/src/template/射流冲击仿真计算数据表.docx
@@ -3356,7 +3356,7 @@
         </w:tc>
         <w:tc>
           <w:tcPr>
-            <w:tcW w:w="1038" w:type="dxa"/>
+            <w:tcW w:w="1231" w:type="dxa"/>
           </w:tcPr>
           <w:p>
             <w:pPr>
@@ -3561,7 +3561,7 @@
         </w:tc>
         <w:tc>
           <w:tcPr>
-            <w:tcW w:w="1038" w:type="dxa"/>
+            <w:tcW w:w="1231" w:type="dxa"/>
           </w:tcPr>
           <w:p>
             <w:pPr>
@@ -3733,7 +3733,7 @@
         </w:tc>
         <w:tc>
           <w:tcPr>
-            <w:tcW w:w="1038" w:type="dxa"/>
+            <w:tcW w:w="1231" w:type="dxa"/>
           </w:tcPr>
           <w:p>
             <w:pPr>
@@ -3775,6 +3775,7 @@
               <w:ind w:firstLineChars="0" w:firstLine="0"/>
               <w:jc w:val="center"/>
             </w:pPr>
+            <w:bookmarkStart w:id="0" w:name="_GoBack" w:colFirst="4" w:colLast="6"/>
             <w:r>
               <w:rPr>
                 <w:rFonts w:hint="eastAsia"/>
@@ -3899,19 +3900,7 @@
               <w:rPr>
                 <w:rFonts w:hint="eastAsia"/>
               </w:rPr>
-              <w:t>{{</w:t>
-            </w:r>
-            <w:r>
-              <w:rPr>
-                <w:rFonts w:hint="eastAsia"/>
-              </w:rPr>
-              <w:t>G1</w:t>
-            </w:r>
-            <w:r>
-              <w:rPr>
-                <w:rFonts w:hint="eastAsia"/>
-              </w:rPr>
-              <w:t>}}</w:t>
+              <w:t>6.8</w:t>
             </w:r>
           </w:p>
         </w:tc>
@@ -3923,55 +3912,31 @@
             <w:pPr>
               <w:pStyle w:val="ad"/>
               <w:ind w:firstLineChars="0" w:firstLine="0"/>
-            </w:pPr>
-            <w:r>
-              <w:rPr>
-                <w:rFonts w:hint="eastAsia"/>
-              </w:rPr>
-              <w:t>{{</w:t>
-            </w:r>
-            <w:r>
-              <w:rPr>
-                <w:rFonts w:hint="eastAsia"/>
-              </w:rPr>
-              <w:t>G2</w:t>
-            </w:r>
-            <w:r>
-              <w:rPr>
-                <w:rFonts w:hint="eastAsia"/>
-              </w:rPr>
-              <w:t>}}</w:t>
-            </w:r>
-          </w:p>
-        </w:tc>
-        <w:tc>
-          <w:tcPr>
-            <w:tcW w:w="1038" w:type="dxa"/>
+              <w:jc w:val="center"/>
+            </w:pPr>
+            <w:r>
+              <w:rPr>
+                <w:rFonts w:hint="eastAsia"/>
+              </w:rPr>
+              <w:t>2.2</w:t>
+            </w:r>
+          </w:p>
+        </w:tc>
+        <w:tc>
+          <w:tcPr>
+            <w:tcW w:w="1231" w:type="dxa"/>
           </w:tcPr>
           <w:p>
             <w:pPr>
               <w:pStyle w:val="ad"/>
               <w:ind w:firstLineChars="0" w:firstLine="0"/>
-            </w:pPr>
-            <w:r>
-              <w:rPr>
-                <w:rFonts w:hint="eastAsia"/>
-              </w:rPr>
-              <w:t>{{</w:t>
-            </w:r>
-            <w:proofErr w:type="spellStart"/>
-            <w:r>
-              <w:rPr>
-                <w:rFonts w:hint="eastAsia"/>
-              </w:rPr>
-              <w:t>Figmax</w:t>
-            </w:r>
-            <w:proofErr w:type="spellEnd"/>
-            <w:r>
-              <w:rPr>
-                <w:rFonts w:hint="eastAsia"/>
-              </w:rPr>
-              <w:t>}}</w:t>
+              <w:jc w:val="center"/>
+            </w:pPr>
+            <w:r>
+              <w:rPr>
+                <w:rFonts w:hint="eastAsia"/>
+              </w:rPr>
+              <w:t>6.8</w:t>
             </w:r>
           </w:p>
         </w:tc>
@@ -3989,6 +3954,7 @@
         </w:tc>
       </w:tr>
     </w:tbl>
+    <w:bookmarkEnd w:id="0"/>
     <w:p>
       <w:pPr>
         <w:ind w:firstLine="480"/>
@@ -9092,8 +9058,6 @@
         <w:ind w:firstLine="480"/>
         <w:jc w:val="center"/>
       </w:pPr>
-      <w:bookmarkStart w:id="0" w:name="_GoBack"/>
-      <w:bookmarkEnd w:id="0"/>
       <w:r>
         <w:rPr>
           <w:rFonts w:hint="eastAsia"/>
@@ -9197,101 +9161,56 @@
         </w:rPr>
         <w:t>:</w:t>
       </w:r>
-      <w:proofErr w:type="gramStart"/>
       <w:r>
         <w:rPr>
           <w:rFonts w:hint="eastAsia"/>
-        </w:rPr>
-        <w:t>FG1max:</w:t>
-      </w:r>
-      <w:proofErr w:type="gramEnd"/>
+          <w:kern w:val="0"/>
+          <w14:ligatures w14:val="none"/>
+        </w:rPr>
+        <w:t xml:space="preserve"> </w:t>
+      </w:r>
       <w:r>
         <w:rPr>
           <w:rFonts w:hint="eastAsia"/>
-        </w:rPr>
-        <w:t>{{G1}}</w:t>
+          <w:kern w:val="0"/>
+          <w14:ligatures w14:val="none"/>
+        </w:rPr>
+        <w:t>FG1max:6.8</w:t>
       </w:r>
       <w:r>
         <w:rPr>
           <w:rFonts w:hint="eastAsia"/>
+          <w:kern w:val="0"/>
+          <w14:ligatures w14:val="none"/>
         </w:rPr>
         <w:tab/>
+        <w:t xml:space="preserve"> FG2min: 2.2 </w:t>
       </w:r>
       <w:r>
         <w:rPr>
           <w:rFonts w:hint="eastAsia"/>
-        </w:rPr>
-        <w:t xml:space="preserve"> </w:t>
-      </w:r>
+          <w:kern w:val="0"/>
+          <w14:ligatures w14:val="none"/>
+        </w:rPr>
+        <w:tab/>
+      </w:r>
+      <w:proofErr w:type="spellStart"/>
       <w:r>
         <w:rPr>
           <w:rFonts w:hint="eastAsia"/>
-        </w:rPr>
-        <w:t>FG2min:</w:t>
-      </w:r>
+          <w:kern w:val="0"/>
+          <w14:ligatures w14:val="none"/>
+        </w:rPr>
+        <w:t>Figmax</w:t>
+      </w:r>
+      <w:proofErr w:type="spellEnd"/>
       <w:r>
         <w:rPr>
           <w:rFonts w:hint="eastAsia"/>
-        </w:rPr>
-        <w:t xml:space="preserve"> </w:t>
-      </w:r>
-      <w:r>
-        <w:rPr>
-          <w:rFonts w:hint="eastAsia"/>
-        </w:rPr>
-        <w:t>{{G2}}</w:t>
-      </w:r>
-      <w:r>
-        <w:rPr>
-          <w:rFonts w:hint="eastAsia"/>
-        </w:rPr>
-        <w:t xml:space="preserve"> </w:t>
-      </w:r>
-      <w:r>
-        <w:rPr>
-          <w:rFonts w:hint="eastAsia"/>
-        </w:rPr>
-        <w:tab/>
-      </w:r>
-      <w:proofErr w:type="spellStart"/>
-      <w:r>
-        <w:rPr>
-          <w:rFonts w:hint="eastAsia"/>
-        </w:rPr>
-        <w:t>Figmax</w:t>
-      </w:r>
-      <w:proofErr w:type="spellEnd"/>
-      <w:r>
-        <w:rPr>
-          <w:rFonts w:hint="eastAsia"/>
-        </w:rPr>
-        <w:t>:</w:t>
-      </w:r>
-      <w:r>
-        <w:rPr>
-          <w:rFonts w:hint="eastAsia"/>
-        </w:rPr>
-        <w:t xml:space="preserve"> </w:t>
-      </w:r>
-      <w:r>
-        <w:rPr>
-          <w:rFonts w:hint="eastAsia"/>
-        </w:rPr>
-        <w:t>{{</w:t>
-      </w:r>
-      <w:proofErr w:type="spellStart"/>
-      <w:r>
-        <w:rPr>
-          <w:rFonts w:hint="eastAsia"/>
-        </w:rPr>
-        <w:t>Figmax</w:t>
-      </w:r>
-      <w:proofErr w:type="spellEnd"/>
-      <w:r>
-        <w:rPr>
-          <w:rFonts w:hint="eastAsia"/>
-        </w:rPr>
-        <w:t>}}</w:t>
+          <w:kern w:val="0"/>
+          <w14:ligatures w14:val="none"/>
+        </w:rPr>
+        <w:t>: 6.8</w:t>
       </w:r>
     </w:p>
     <w:p>
@@ -16523,7 +16442,7 @@
                 <w:sz w:val="21"/>
                 <w:szCs w:val="21"/>
               </w:rPr>
-              <w:t>8</w:t>
+              <w:t>3</w:t>
             </w:r>
             <w:r>
               <w:rPr>
@@ -18723,7 +18642,7 @@
   <a:extraClrSchemeLst/>
   <a:extLst>
     <a:ext uri="{05A4C25C-085E-4340-85A3-A5531E510DB2}">
-      <thm15:themeFamily xmlns:thm15="http://schemas.microsoft.com/office/thememl/2012/main" xmlns="" name="Office Theme" id="{2E142A2C-CD16-42D6-873A-C26D2A0506FA}" vid="{1BDDFF52-6CD6-40A5-AB3C-68EB2F1E4D0A}"/>
+      <thm15:themeFamily xmlns="" xmlns:thm15="http://schemas.microsoft.com/office/thememl/2012/main" name="Office Theme" id="{2E142A2C-CD16-42D6-873A-C26D2A0506FA}" vid="{1BDDFF52-6CD6-40A5-AB3C-68EB2F1E4D0A}"/>
     </a:ext>
   </a:extLst>
 </a:theme>

</xml_diff>